<commit_message>
lab_01: add byte, word, lock
</commit_message>
<xml_diff>
--- a/lab_01/doc/lr.docx
+++ b/lab_01/doc/lr.docx
@@ -108,7 +108,6 @@
         <w:pStyle w:val="afa"/>
         <w:rPr>
           <w:rFonts w:ascii="Aptos Serif" w:hAnsi="Aptos Serif" w:cs="Aptos Serif"/>
-          <w:lang w:val="ru-RU"/>
         </w:rPr>
       </w:pPr>
       <w:r>
@@ -1314,15 +1313,65 @@
         <w:pStyle w:val="afa"/>
         <w:rPr>
           <w:rFonts w:ascii="Aptos Serif" w:hAnsi="Aptos Serif" w:cs="Aptos Serif"/>
-          <w:lang w:val="ru-RU"/>
-        </w:rPr>
-      </w:pPr>
-      <w:r>
-        <w:rPr>
-          <w:rFonts w:ascii="Aptos Serif" w:hAnsi="Aptos Serif" w:cs="Aptos Serif"/>
-          <w:lang w:val="ru-RU"/>
-        </w:rPr>
-        <w:t xml:space="preserve">; Инкремент старших 2 байт счетчика </w:t>
+        </w:rPr>
+      </w:pPr>
+      <w:r>
+        <w:rPr>
+          <w:rFonts w:ascii="Aptos Serif" w:hAnsi="Aptos Serif" w:cs="Aptos Serif"/>
+        </w:rPr>
+        <w:t xml:space="preserve">; </w:t>
+      </w:r>
+      <w:r>
+        <w:rPr>
+          <w:rFonts w:ascii="Aptos Serif" w:hAnsi="Aptos Serif" w:cs="Aptos Serif"/>
+          <w:lang w:val="ru-RU"/>
+        </w:rPr>
+        <w:t>Инкремент</w:t>
+      </w:r>
+      <w:r>
+        <w:rPr>
+          <w:rFonts w:ascii="Aptos Serif" w:hAnsi="Aptos Serif" w:cs="Aptos Serif"/>
+        </w:rPr>
+        <w:t xml:space="preserve"> </w:t>
+      </w:r>
+      <w:r>
+        <w:rPr>
+          <w:rFonts w:ascii="Aptos Serif" w:hAnsi="Aptos Serif" w:cs="Aptos Serif"/>
+          <w:lang w:val="ru-RU"/>
+        </w:rPr>
+        <w:t>старших</w:t>
+      </w:r>
+      <w:r>
+        <w:rPr>
+          <w:rFonts w:ascii="Aptos Serif" w:hAnsi="Aptos Serif" w:cs="Aptos Serif"/>
+        </w:rPr>
+        <w:t xml:space="preserve"> 2 </w:t>
+      </w:r>
+      <w:r>
+        <w:rPr>
+          <w:rFonts w:ascii="Aptos Serif" w:hAnsi="Aptos Serif" w:cs="Aptos Serif"/>
+          <w:lang w:val="ru-RU"/>
+        </w:rPr>
+        <w:t>байт</w:t>
+      </w:r>
+      <w:r>
+        <w:rPr>
+          <w:rFonts w:ascii="Aptos Serif" w:hAnsi="Aptos Serif" w:cs="Aptos Serif"/>
+        </w:rPr>
+        <w:t xml:space="preserve"> </w:t>
+      </w:r>
+      <w:r>
+        <w:rPr>
+          <w:rFonts w:ascii="Aptos Serif" w:hAnsi="Aptos Serif" w:cs="Aptos Serif"/>
+          <w:lang w:val="ru-RU"/>
+        </w:rPr>
+        <w:t>счетчика</w:t>
+      </w:r>
+      <w:r>
+        <w:rPr>
+          <w:rFonts w:ascii="Aptos Serif" w:hAnsi="Aptos Serif" w:cs="Aptos Serif"/>
+        </w:rPr>
+        <w:t xml:space="preserve"> </w:t>
       </w:r>
       <w:r>
         <w:rPr>
@@ -2189,7 +2238,21 @@
           <w:rFonts w:ascii="Aptos Serif" w:hAnsi="Aptos Serif" w:cs="Aptos Serif"/>
           <w:lang w:val="ru-RU"/>
         </w:rPr>
-        <w:t xml:space="preserve"> счетчика таймера и </w:t>
+        <w:t xml:space="preserve"> счетчика </w:t>
+      </w:r>
+      <w:r>
+        <w:rPr>
+          <w:rFonts w:ascii="Aptos Serif" w:hAnsi="Aptos Serif" w:cs="Aptos Serif"/>
+          <w:lang w:val="ru-RU"/>
+        </w:rPr>
+        <w:t>времени</w:t>
+      </w:r>
+      <w:r>
+        <w:rPr>
+          <w:rFonts w:ascii="Aptos Serif" w:hAnsi="Aptos Serif" w:cs="Aptos Serif"/>
+          <w:lang w:val="ru-RU"/>
+        </w:rPr>
+        <w:t xml:space="preserve"> и </w:t>
       </w:r>
       <w:r>
         <w:rPr>
@@ -2888,12 +2951,14 @@
         <w:rPr>
           <w:rFonts w:ascii="Aptos Serif" w:hAnsi="Aptos Serif" w:cs="Aptos Serif"/>
           <w:sz w:val="22"/>
-        </w:rPr>
-      </w:pPr>
-      <w:r>
-        <w:rPr>
-          <w:rFonts w:ascii="Aptos Serif" w:hAnsi="Aptos Serif" w:cs="Aptos Serif"/>
-          <w:sz w:val="22"/>
+          <w:lang w:val="en-US"/>
+        </w:rPr>
+      </w:pPr>
+      <w:r>
+        <w:rPr>
+          <w:rFonts w:ascii="Aptos Serif" w:hAnsi="Aptos Serif" w:cs="Aptos Serif"/>
+          <w:sz w:val="22"/>
+          <w:lang w:val="en-US"/>
         </w:rPr>
         <w:t>020</w:t>
       </w:r>
@@ -2909,6 +2974,7 @@
         <w:rPr>
           <w:rFonts w:ascii="Aptos Serif" w:hAnsi="Aptos Serif" w:cs="Aptos Serif"/>
           <w:sz w:val="22"/>
+          <w:lang w:val="en-US"/>
         </w:rPr>
         <w:t>:077</w:t>
       </w:r>
@@ -2924,6 +2990,7 @@
         <w:rPr>
           <w:rFonts w:ascii="Aptos Serif" w:hAnsi="Aptos Serif" w:cs="Aptos Serif"/>
           <w:sz w:val="22"/>
+          <w:lang w:val="en-US"/>
         </w:rPr>
         <w:t xml:space="preserve">  </w:t>
       </w:r>
@@ -2939,6 +3006,7 @@
         <w:rPr>
           <w:rFonts w:ascii="Aptos Serif" w:hAnsi="Aptos Serif" w:cs="Aptos Serif"/>
           <w:sz w:val="22"/>
+          <w:lang w:val="en-US"/>
         </w:rPr>
         <w:t xml:space="preserve"> 0</w:t>
       </w:r>
@@ -2954,6 +3022,7 @@
         <w:rPr>
           <w:rFonts w:ascii="Aptos Serif" w:hAnsi="Aptos Serif" w:cs="Aptos Serif"/>
           <w:sz w:val="22"/>
+          <w:lang w:val="en-US"/>
         </w:rPr>
         <w:t xml:space="preserve"> 0040</w:t>
       </w:r>
@@ -2961,27 +3030,31 @@
         <w:rPr>
           <w:rFonts w:ascii="Aptos Serif" w:hAnsi="Aptos Serif" w:cs="Aptos Serif"/>
           <w:sz w:val="22"/>
-        </w:rPr>
-        <w:tab/>
-      </w:r>
-      <w:r>
-        <w:rPr>
-          <w:rFonts w:ascii="Aptos Serif" w:hAnsi="Aptos Serif" w:cs="Aptos Serif"/>
-          <w:sz w:val="22"/>
-        </w:rPr>
-        <w:tab/>
-      </w:r>
-      <w:r>
-        <w:rPr>
-          <w:rFonts w:ascii="Aptos Serif" w:hAnsi="Aptos Serif" w:cs="Aptos Serif"/>
-          <w:sz w:val="22"/>
-        </w:rPr>
-        <w:tab/>
-      </w:r>
-      <w:r>
-        <w:rPr>
-          <w:rFonts w:ascii="Aptos Serif" w:hAnsi="Aptos Serif" w:cs="Aptos Serif"/>
-          <w:sz w:val="22"/>
+          <w:lang w:val="en-US"/>
+        </w:rPr>
+        <w:tab/>
+      </w:r>
+      <w:r>
+        <w:rPr>
+          <w:rFonts w:ascii="Aptos Serif" w:hAnsi="Aptos Serif" w:cs="Aptos Serif"/>
+          <w:sz w:val="22"/>
+          <w:lang w:val="en-US"/>
+        </w:rPr>
+        <w:tab/>
+      </w:r>
+      <w:r>
+        <w:rPr>
+          <w:rFonts w:ascii="Aptos Serif" w:hAnsi="Aptos Serif" w:cs="Aptos Serif"/>
+          <w:sz w:val="22"/>
+          <w:lang w:val="en-US"/>
+        </w:rPr>
+        <w:tab/>
+      </w:r>
+      <w:r>
+        <w:rPr>
+          <w:rFonts w:ascii="Aptos Serif" w:hAnsi="Aptos Serif" w:cs="Aptos Serif"/>
+          <w:sz w:val="22"/>
+          <w:lang w:val="en-US"/>
         </w:rPr>
         <w:tab/>
       </w:r>
@@ -2998,7 +3071,6 @@
           <w:rStyle w:val="afd"/>
           <w:rFonts w:ascii="Aptos Serif" w:hAnsi="Aptos Serif" w:cs="Aptos Serif"/>
           <w:sz w:val="22"/>
-          <w:lang w:val="ru-RU"/>
         </w:rPr>
         <w:tab/>
       </w:r>
@@ -3015,7 +3087,6 @@
           <w:rStyle w:val="afd"/>
           <w:rFonts w:ascii="Aptos Serif" w:hAnsi="Aptos Serif" w:cs="Aptos Serif"/>
           <w:sz w:val="22"/>
-          <w:lang w:val="ru-RU"/>
         </w:rPr>
         <w:t xml:space="preserve"> </w:t>
       </w:r>
@@ -3032,7 +3103,6 @@
           <w:rStyle w:val="afd"/>
           <w:rFonts w:ascii="Aptos Serif" w:hAnsi="Aptos Serif" w:cs="Aptos Serif"/>
           <w:sz w:val="22"/>
-          <w:lang w:val="ru-RU"/>
         </w:rPr>
         <w:t xml:space="preserve"> </w:t>
       </w:r>
@@ -3048,6 +3118,7 @@
         <w:rPr>
           <w:rFonts w:ascii="Aptos Serif" w:hAnsi="Aptos Serif" w:cs="Aptos Serif"/>
           <w:sz w:val="22"/>
+          <w:lang w:val="en-US"/>
         </w:rPr>
         <w:t>:[40</w:t>
       </w:r>
@@ -3063,6 +3134,7 @@
         <w:rPr>
           <w:rFonts w:ascii="Aptos Serif" w:hAnsi="Aptos Serif" w:cs="Aptos Serif"/>
           <w:sz w:val="22"/>
+          <w:lang w:val="en-US"/>
         </w:rPr>
         <w:t>]</w:t>
       </w:r>
@@ -3070,6 +3142,7 @@
         <w:rPr>
           <w:rFonts w:ascii="Aptos Serif" w:hAnsi="Aptos Serif" w:cs="Aptos Serif"/>
           <w:sz w:val="22"/>
+          <w:lang w:val="en-US"/>
         </w:rPr>
         <w:tab/>
       </w:r>
@@ -3078,7 +3151,6 @@
           <w:rStyle w:val="afb"/>
           <w:rFonts w:ascii="Aptos Serif" w:hAnsi="Aptos Serif" w:cs="Aptos Serif"/>
           <w:sz w:val="22"/>
-          <w:lang w:val="ru-RU"/>
         </w:rPr>
         <w:t>; (0040:0040=13</w:t>
       </w:r>
@@ -3095,7 +3167,6 @@
           <w:rStyle w:val="afb"/>
           <w:rFonts w:ascii="Aptos Serif" w:hAnsi="Aptos Serif" w:cs="Aptos Serif"/>
           <w:sz w:val="22"/>
-          <w:lang w:val="ru-RU"/>
         </w:rPr>
         <w:t>)</w:t>
       </w:r>
@@ -3250,37 +3321,79 @@
           <w:rStyle w:val="afb"/>
           <w:rFonts w:ascii="Aptos Serif" w:hAnsi="Aptos Serif" w:cs="Aptos Serif"/>
           <w:sz w:val="22"/>
-        </w:rPr>
-      </w:pPr>
-      <w:r>
-        <w:rPr>
-          <w:rFonts w:ascii="Aptos Serif" w:hAnsi="Aptos Serif" w:cs="Aptos Serif"/>
-          <w:sz w:val="22"/>
-          <w:lang w:val="en-US"/>
-        </w:rPr>
-        <w:t>020C:0783  80 26 003F F0</w:t>
-      </w:r>
-      <w:r>
-        <w:rPr>
-          <w:rFonts w:ascii="Aptos Serif" w:hAnsi="Aptos Serif" w:cs="Aptos Serif"/>
-          <w:sz w:val="22"/>
-          <w:lang w:val="en-US"/>
-        </w:rPr>
-        <w:tab/>
-      </w:r>
-      <w:r>
-        <w:rPr>
-          <w:rFonts w:ascii="Aptos Serif" w:hAnsi="Aptos Serif" w:cs="Aptos Serif"/>
-          <w:sz w:val="22"/>
-          <w:lang w:val="en-US"/>
-        </w:rPr>
-        <w:tab/>
-      </w:r>
-      <w:r>
-        <w:rPr>
-          <w:rFonts w:ascii="Aptos Serif" w:hAnsi="Aptos Serif" w:cs="Aptos Serif"/>
-          <w:sz w:val="22"/>
-          <w:lang w:val="en-US"/>
+          <w:lang w:val="ru-RU"/>
+        </w:rPr>
+      </w:pPr>
+      <w:r>
+        <w:rPr>
+          <w:rFonts w:ascii="Aptos Serif" w:hAnsi="Aptos Serif" w:cs="Aptos Serif"/>
+          <w:sz w:val="22"/>
+        </w:rPr>
+        <w:t>020</w:t>
+      </w:r>
+      <w:r>
+        <w:rPr>
+          <w:rFonts w:ascii="Aptos Serif" w:hAnsi="Aptos Serif" w:cs="Aptos Serif"/>
+          <w:sz w:val="22"/>
+          <w:lang w:val="en-US"/>
+        </w:rPr>
+        <w:t>C</w:t>
+      </w:r>
+      <w:r>
+        <w:rPr>
+          <w:rFonts w:ascii="Aptos Serif" w:hAnsi="Aptos Serif" w:cs="Aptos Serif"/>
+          <w:sz w:val="22"/>
+        </w:rPr>
+        <w:t>:0783  80 26 003</w:t>
+      </w:r>
+      <w:r>
+        <w:rPr>
+          <w:rFonts w:ascii="Aptos Serif" w:hAnsi="Aptos Serif" w:cs="Aptos Serif"/>
+          <w:sz w:val="22"/>
+          <w:lang w:val="en-US"/>
+        </w:rPr>
+        <w:t>F</w:t>
+      </w:r>
+      <w:r>
+        <w:rPr>
+          <w:rFonts w:ascii="Aptos Serif" w:hAnsi="Aptos Serif" w:cs="Aptos Serif"/>
+          <w:sz w:val="22"/>
+        </w:rPr>
+        <w:t xml:space="preserve"> </w:t>
+      </w:r>
+      <w:r>
+        <w:rPr>
+          <w:rFonts w:ascii="Aptos Serif" w:hAnsi="Aptos Serif" w:cs="Aptos Serif"/>
+          <w:sz w:val="22"/>
+          <w:lang w:val="en-US"/>
+        </w:rPr>
+        <w:t>F</w:t>
+      </w:r>
+      <w:r>
+        <w:rPr>
+          <w:rFonts w:ascii="Aptos Serif" w:hAnsi="Aptos Serif" w:cs="Aptos Serif"/>
+          <w:sz w:val="22"/>
+        </w:rPr>
+        <w:t>0</w:t>
+      </w:r>
+      <w:r>
+        <w:rPr>
+          <w:rFonts w:ascii="Aptos Serif" w:hAnsi="Aptos Serif" w:cs="Aptos Serif"/>
+          <w:sz w:val="22"/>
+        </w:rPr>
+        <w:tab/>
+      </w:r>
+      <w:r>
+        <w:rPr>
+          <w:rFonts w:ascii="Aptos Serif" w:hAnsi="Aptos Serif" w:cs="Aptos Serif"/>
+          <w:sz w:val="22"/>
+        </w:rPr>
+        <w:tab/>
+      </w:r>
+      <w:r>
+        <w:rPr>
+          <w:rFonts w:ascii="Aptos Serif" w:hAnsi="Aptos Serif" w:cs="Aptos Serif"/>
+          <w:sz w:val="22"/>
         </w:rPr>
         <w:tab/>
       </w:r>
@@ -3297,23 +3410,101 @@
           <w:rStyle w:val="afd"/>
           <w:rFonts w:ascii="Aptos Serif" w:hAnsi="Aptos Serif" w:cs="Aptos Serif"/>
           <w:sz w:val="22"/>
-        </w:rPr>
-        <w:tab/>
-        <w:t>byte ptr ds</w:t>
-      </w:r>
-      <w:r>
-        <w:rPr>
-          <w:rFonts w:ascii="Aptos Serif" w:hAnsi="Aptos Serif" w:cs="Aptos Serif"/>
-          <w:sz w:val="22"/>
-          <w:lang w:val="en-US"/>
-        </w:rPr>
-        <w:t>:[3Fh],0F0h</w:t>
-      </w:r>
-      <w:r>
-        <w:rPr>
-          <w:rFonts w:ascii="Aptos Serif" w:hAnsi="Aptos Serif" w:cs="Aptos Serif"/>
-          <w:sz w:val="22"/>
-          <w:lang w:val="en-US"/>
+          <w:lang w:val="ru-RU"/>
+        </w:rPr>
+        <w:tab/>
+      </w:r>
+      <w:r>
+        <w:rPr>
+          <w:rStyle w:val="afd"/>
+          <w:rFonts w:ascii="Aptos Serif" w:hAnsi="Aptos Serif" w:cs="Aptos Serif"/>
+          <w:sz w:val="22"/>
+        </w:rPr>
+        <w:t>byte</w:t>
+      </w:r>
+      <w:r>
+        <w:rPr>
+          <w:rStyle w:val="afd"/>
+          <w:rFonts w:ascii="Aptos Serif" w:hAnsi="Aptos Serif" w:cs="Aptos Serif"/>
+          <w:sz w:val="22"/>
+          <w:lang w:val="ru-RU"/>
+        </w:rPr>
+        <w:t xml:space="preserve"> </w:t>
+      </w:r>
+      <w:r>
+        <w:rPr>
+          <w:rStyle w:val="afd"/>
+          <w:rFonts w:ascii="Aptos Serif" w:hAnsi="Aptos Serif" w:cs="Aptos Serif"/>
+          <w:sz w:val="22"/>
+        </w:rPr>
+        <w:t>ptr</w:t>
+      </w:r>
+      <w:r>
+        <w:rPr>
+          <w:rStyle w:val="afd"/>
+          <w:rFonts w:ascii="Aptos Serif" w:hAnsi="Aptos Serif" w:cs="Aptos Serif"/>
+          <w:sz w:val="22"/>
+          <w:lang w:val="ru-RU"/>
+        </w:rPr>
+        <w:t xml:space="preserve"> </w:t>
+      </w:r>
+      <w:r>
+        <w:rPr>
+          <w:rStyle w:val="afd"/>
+          <w:rFonts w:ascii="Aptos Serif" w:hAnsi="Aptos Serif" w:cs="Aptos Serif"/>
+          <w:sz w:val="22"/>
+        </w:rPr>
+        <w:t>ds</w:t>
+      </w:r>
+      <w:r>
+        <w:rPr>
+          <w:rFonts w:ascii="Aptos Serif" w:hAnsi="Aptos Serif" w:cs="Aptos Serif"/>
+          <w:sz w:val="22"/>
+        </w:rPr>
+        <w:t>:[3</w:t>
+      </w:r>
+      <w:r>
+        <w:rPr>
+          <w:rFonts w:ascii="Aptos Serif" w:hAnsi="Aptos Serif" w:cs="Aptos Serif"/>
+          <w:sz w:val="22"/>
+          <w:lang w:val="en-US"/>
+        </w:rPr>
+        <w:t>Fh</w:t>
+      </w:r>
+      <w:r>
+        <w:rPr>
+          <w:rFonts w:ascii="Aptos Serif" w:hAnsi="Aptos Serif" w:cs="Aptos Serif"/>
+          <w:sz w:val="22"/>
+        </w:rPr>
+        <w:t>],0</w:t>
+      </w:r>
+      <w:r>
+        <w:rPr>
+          <w:rFonts w:ascii="Aptos Serif" w:hAnsi="Aptos Serif" w:cs="Aptos Serif"/>
+          <w:sz w:val="22"/>
+          <w:lang w:val="en-US"/>
+        </w:rPr>
+        <w:t>F</w:t>
+      </w:r>
+      <w:r>
+        <w:rPr>
+          <w:rFonts w:ascii="Aptos Serif" w:hAnsi="Aptos Serif" w:cs="Aptos Serif"/>
+          <w:sz w:val="22"/>
+        </w:rPr>
+        <w:t>0</w:t>
+      </w:r>
+      <w:r>
+        <w:rPr>
+          <w:rFonts w:ascii="Aptos Serif" w:hAnsi="Aptos Serif" w:cs="Aptos Serif"/>
+          <w:sz w:val="22"/>
+          <w:lang w:val="en-US"/>
+        </w:rPr>
+        <w:t>h</w:t>
+      </w:r>
+      <w:r>
+        <w:rPr>
+          <w:rFonts w:ascii="Aptos Serif" w:hAnsi="Aptos Serif" w:cs="Aptos Serif"/>
+          <w:sz w:val="22"/>
         </w:rPr>
         <w:tab/>
       </w:r>
@@ -3322,8 +3513,26 @@
           <w:rStyle w:val="afb"/>
           <w:rFonts w:ascii="Aptos Serif" w:hAnsi="Aptos Serif" w:cs="Aptos Serif"/>
           <w:sz w:val="22"/>
-        </w:rPr>
-        <w:t>; (0040:003F=0)</w:t>
+          <w:lang w:val="ru-RU"/>
+        </w:rPr>
+        <w:t>; (0040:003</w:t>
+      </w:r>
+      <w:r>
+        <w:rPr>
+          <w:rStyle w:val="afb"/>
+          <w:rFonts w:ascii="Aptos Serif" w:hAnsi="Aptos Serif" w:cs="Aptos Serif"/>
+          <w:sz w:val="22"/>
+        </w:rPr>
+        <w:t>F</w:t>
+      </w:r>
+      <w:r>
+        <w:rPr>
+          <w:rStyle w:val="afb"/>
+          <w:rFonts w:ascii="Aptos Serif" w:hAnsi="Aptos Serif" w:cs="Aptos Serif"/>
+          <w:sz w:val="22"/>
+          <w:lang w:val="ru-RU"/>
+        </w:rPr>
+        <w:t>=0)</w:t>
       </w:r>
     </w:p>
     <w:p>
@@ -3930,7 +4139,6 @@
         <w:pStyle w:val="afa"/>
         <w:rPr>
           <w:rFonts w:ascii="Aptos Serif" w:hAnsi="Aptos Serif" w:cs="Aptos Serif"/>
-          <w:lang w:val="ru-RU"/>
         </w:rPr>
       </w:pPr>
       <w:r>
@@ -8420,10 +8628,10 @@
       </w:pPr>
       <w:r>
         <w:drawing>
-          <wp:inline distT="0" distB="0" distL="0" distR="0" wp14:anchorId="5734996A" wp14:editId="17EE5369">
-            <wp:extent cx="4096322" cy="7849695"/>
+          <wp:inline distT="0" distB="0" distL="0" distR="0" wp14:anchorId="32A30583" wp14:editId="33174277">
+            <wp:extent cx="3924848" cy="7659169"/>
             <wp:effectExtent l="0" t="0" r="0" b="0"/>
-            <wp:docPr id="388310572" name="Рисунок 1"/>
+            <wp:docPr id="1339849688" name="Рисунок 1"/>
             <wp:cNvGraphicFramePr>
               <a:graphicFrameLocks xmlns:a="http://schemas.openxmlformats.org/drawingml/2006/main" noChangeAspect="1"/>
             </wp:cNvGraphicFramePr>
@@ -8431,7 +8639,7 @@
               <a:graphicData uri="http://schemas.openxmlformats.org/drawingml/2006/picture">
                 <pic:pic xmlns:pic="http://schemas.openxmlformats.org/drawingml/2006/picture">
                   <pic:nvPicPr>
-                    <pic:cNvPr id="388310572" name=""/>
+                    <pic:cNvPr id="1339849688" name=""/>
                     <pic:cNvPicPr/>
                   </pic:nvPicPr>
                   <pic:blipFill>
@@ -8443,7 +8651,7 @@
                   <pic:spPr>
                     <a:xfrm>
                       <a:off x="0" y="0"/>
-                      <a:ext cx="4096322" cy="7849695"/>
+                      <a:ext cx="3924848" cy="7659169"/>
                     </a:xfrm>
                     <a:prstGeom prst="rect">
                       <a:avLst/>
@@ -8470,10 +8678,10 @@
         </w:rPr>
         <w:lastRenderedPageBreak/>
         <w:drawing>
-          <wp:inline distT="0" distB="0" distL="0" distR="0" wp14:anchorId="5C0F3607" wp14:editId="4183F9D5">
-            <wp:extent cx="6303981" cy="8540843"/>
-            <wp:effectExtent l="0" t="0" r="1905" b="0"/>
-            <wp:docPr id="1884983359" name="Рисунок 1"/>
+          <wp:inline distT="0" distB="0" distL="0" distR="0" wp14:anchorId="77608363" wp14:editId="4C9D6D64">
+            <wp:extent cx="5611008" cy="7830643"/>
+            <wp:effectExtent l="0" t="0" r="8890" b="0"/>
+            <wp:docPr id="1615933085" name="Рисунок 1"/>
             <wp:cNvGraphicFramePr>
               <a:graphicFrameLocks xmlns:a="http://schemas.openxmlformats.org/drawingml/2006/main" noChangeAspect="1"/>
             </wp:cNvGraphicFramePr>
@@ -8481,7 +8689,7 @@
               <a:graphicData uri="http://schemas.openxmlformats.org/drawingml/2006/picture">
                 <pic:pic xmlns:pic="http://schemas.openxmlformats.org/drawingml/2006/picture">
                   <pic:nvPicPr>
-                    <pic:cNvPr id="1884983359" name=""/>
+                    <pic:cNvPr id="1615933085" name=""/>
                     <pic:cNvPicPr/>
                   </pic:nvPicPr>
                   <pic:blipFill>
@@ -8493,7 +8701,7 @@
                   <pic:spPr>
                     <a:xfrm>
                       <a:off x="0" y="0"/>
-                      <a:ext cx="6320286" cy="8562933"/>
+                      <a:ext cx="5611008" cy="7830643"/>
                     </a:xfrm>
                     <a:prstGeom prst="rect">
                       <a:avLst/>
@@ -8528,10 +8736,10 @@
       <w:r>
         <w:lastRenderedPageBreak/>
         <w:drawing>
-          <wp:inline distT="0" distB="0" distL="0" distR="0" wp14:anchorId="473683FC" wp14:editId="4D1E7F15">
-            <wp:extent cx="4197955" cy="9391426"/>
-            <wp:effectExtent l="0" t="0" r="0" b="635"/>
-            <wp:docPr id="1474966798" name="Рисунок 1"/>
+          <wp:inline distT="0" distB="0" distL="0" distR="0" wp14:anchorId="68111110" wp14:editId="7D376226">
+            <wp:extent cx="4352925" cy="9196950"/>
+            <wp:effectExtent l="0" t="0" r="0" b="4445"/>
+            <wp:docPr id="1497956151" name="Рисунок 1"/>
             <wp:cNvGraphicFramePr>
               <a:graphicFrameLocks xmlns:a="http://schemas.openxmlformats.org/drawingml/2006/main" noChangeAspect="1"/>
             </wp:cNvGraphicFramePr>
@@ -8539,7 +8747,7 @@
               <a:graphicData uri="http://schemas.openxmlformats.org/drawingml/2006/picture">
                 <pic:pic xmlns:pic="http://schemas.openxmlformats.org/drawingml/2006/picture">
                   <pic:nvPicPr>
-                    <pic:cNvPr id="1474966798" name=""/>
+                    <pic:cNvPr id="1497956151" name=""/>
                     <pic:cNvPicPr/>
                   </pic:nvPicPr>
                   <pic:blipFill>
@@ -8551,7 +8759,7 @@
                   <pic:spPr>
                     <a:xfrm>
                       <a:off x="0" y="0"/>
-                      <a:ext cx="4221568" cy="9444253"/>
+                      <a:ext cx="4359501" cy="9210843"/>
                     </a:xfrm>
                     <a:prstGeom prst="rect">
                       <a:avLst/>
@@ -8593,10 +8801,10 @@
       </w:pPr>
       <w:r>
         <w:drawing>
-          <wp:inline distT="0" distB="0" distL="0" distR="0" wp14:anchorId="238F269A" wp14:editId="3FB19840">
-            <wp:extent cx="5517980" cy="8896575"/>
-            <wp:effectExtent l="0" t="0" r="6985" b="0"/>
-            <wp:docPr id="631998841" name="Рисунок 1"/>
+          <wp:inline distT="0" distB="0" distL="0" distR="0" wp14:anchorId="69CE8203" wp14:editId="13C8DA6C">
+            <wp:extent cx="5329641" cy="8623005"/>
+            <wp:effectExtent l="0" t="0" r="4445" b="6985"/>
+            <wp:docPr id="1088688681" name="Рисунок 1"/>
             <wp:cNvGraphicFramePr>
               <a:graphicFrameLocks xmlns:a="http://schemas.openxmlformats.org/drawingml/2006/main" noChangeAspect="1"/>
             </wp:cNvGraphicFramePr>
@@ -8604,7 +8812,7 @@
               <a:graphicData uri="http://schemas.openxmlformats.org/drawingml/2006/picture">
                 <pic:pic xmlns:pic="http://schemas.openxmlformats.org/drawingml/2006/picture">
                   <pic:nvPicPr>
-                    <pic:cNvPr id="631998841" name=""/>
+                    <pic:cNvPr id="1088688681" name=""/>
                     <pic:cNvPicPr/>
                   </pic:nvPicPr>
                   <pic:blipFill>
@@ -8616,7 +8824,7 @@
                   <pic:spPr>
                     <a:xfrm>
                       <a:off x="0" y="0"/>
-                      <a:ext cx="5529964" cy="8915897"/>
+                      <a:ext cx="5338991" cy="8638133"/>
                     </a:xfrm>
                     <a:prstGeom prst="rect">
                       <a:avLst/>

</xml_diff>